<commit_message>
docs: enforce DOCX+PDF-only courseware, add LP slide-refs, sync skills
- wsq-lesson-plan / wsq-learner-guide: add HARD RULE that deliverables are
  DOCX + PDF only — Markdown is a throwaway build intermediate, never kept
- Remove the LG/LP Markdown mirrors (Learner-Guide.md, LG-*.md, LP-*.md)
- LP: add mandatory Slides column (deck page ranges read from the v12 deck),
  table borders + house header shading, and a Page X of Y footer
- Add the shared single-source build pipeline under wsq-slides/reference/
- README: drop the deleted Markdown-source row; note DOCX+PDF-only rule

Co-Authored-By: Claude Opus 4.8 (1M context) <noreply@anthropic.com>
</commit_message>
<xml_diff>
--- a/courseware/LP-Agentic AI Applications with Claude Code.docx
+++ b/courseware/LP-Agentic AI Applications with Claude Code.docx
@@ -206,13 +206,21 @@
         <w:tc>
           <w:tcPr>
             <w:tcW w:type="dxa" w:w="2340"/>
+            <w:shd w:val="clear" w:color="auto" w:fill="1F6FEB"/>
           </w:tcPr>
           <w:p>
-            <w:r/>
             <w:r>
               <w:rPr>
                 <w:b/>
-                <w:sz w:val="20"/>
+                <w:color w:val="FFFFFF"/>
+                <w:sz w:val="19"/>
+              </w:rPr>
+            </w:r>
+            <w:r>
+              <w:rPr>
+                <w:b/>
+                <w:color w:val="FFFFFF"/>
+                <w:sz w:val="19"/>
               </w:rPr>
               <w:t>Version Number</w:t>
             </w:r>
@@ -221,13 +229,21 @@
         <w:tc>
           <w:tcPr>
             <w:tcW w:type="dxa" w:w="2340"/>
+            <w:shd w:val="clear" w:color="auto" w:fill="1F6FEB"/>
           </w:tcPr>
           <w:p>
-            <w:r/>
             <w:r>
               <w:rPr>
                 <w:b/>
-                <w:sz w:val="20"/>
+                <w:color w:val="FFFFFF"/>
+                <w:sz w:val="19"/>
+              </w:rPr>
+            </w:r>
+            <w:r>
+              <w:rPr>
+                <w:b/>
+                <w:color w:val="FFFFFF"/>
+                <w:sz w:val="19"/>
               </w:rPr>
               <w:t>Effective Date of Release</w:t>
             </w:r>
@@ -236,13 +252,21 @@
         <w:tc>
           <w:tcPr>
             <w:tcW w:type="dxa" w:w="2340"/>
+            <w:shd w:val="clear" w:color="auto" w:fill="1F6FEB"/>
           </w:tcPr>
           <w:p>
-            <w:r/>
             <w:r>
               <w:rPr>
                 <w:b/>
-                <w:sz w:val="20"/>
+                <w:color w:val="FFFFFF"/>
+                <w:sz w:val="19"/>
+              </w:rPr>
+            </w:r>
+            <w:r>
+              <w:rPr>
+                <w:b/>
+                <w:color w:val="FFFFFF"/>
+                <w:sz w:val="19"/>
               </w:rPr>
               <w:t>Summary of Included Changes</w:t>
             </w:r>
@@ -251,13 +275,21 @@
         <w:tc>
           <w:tcPr>
             <w:tcW w:type="dxa" w:w="2340"/>
+            <w:shd w:val="clear" w:color="auto" w:fill="1F6FEB"/>
           </w:tcPr>
           <w:p>
-            <w:r/>
             <w:r>
               <w:rPr>
                 <w:b/>
-                <w:sz w:val="20"/>
+                <w:color w:val="FFFFFF"/>
+                <w:sz w:val="19"/>
+              </w:rPr>
+            </w:r>
+            <w:r>
+              <w:rPr>
+                <w:b/>
+                <w:color w:val="FFFFFF"/>
+                <w:sz w:val="19"/>
               </w:rPr>
               <w:t>Author</w:t>
             </w:r>
@@ -614,15 +646,16 @@
     </w:p>
     <w:tbl>
       <w:tblPr>
-        <w:tblStyle w:val="Table"/>
+        <w:tblStyle w:val="TableGrid"/>
         <w:tblW w:type="pct" w:w="5000.0"/>
         <w:tblLook w:firstRow="1"/>
       </w:tblPr>
       <w:tblGrid>
-        <w:gridCol w:w="1131"/>
-        <w:gridCol w:w="1885"/>
-        <w:gridCol w:w="3394"/>
-        <w:gridCol w:w="1508"/>
+        <w:gridCol w:w="1102"/>
+        <w:gridCol w:w="1339"/>
+        <w:gridCol w:w="2913"/>
+        <w:gridCol w:w="1417"/>
+        <w:gridCol w:w="1228"/>
       </w:tblGrid>
       <w:tr>
         <w:trPr>
@@ -630,10 +663,12 @@
         </w:trPr>
         <w:tc>
           <w:tcPr>
+            <w:tcW w:type="dxa" w:w="1102"/>
             <w:tcBorders>
               <w:bottom w:val="single"/>
             </w:tcBorders>
             <w:vAlign w:val="bottom"/>
+            <w:shd w:val="clear" w:color="auto" w:fill="1F6FEB"/>
           </w:tcPr>
           <w:p>
             <w:pPr>
@@ -641,16 +676,23 @@
               <w:jc w:val="left"/>
             </w:pPr>
             <w:r>
+              <w:rPr>
+                <w:b/>
+                <w:color w:val="FFFFFF"/>
+                <w:sz w:val="19"/>
+              </w:rPr>
               <w:t xml:space="preserve">Time</w:t>
             </w:r>
           </w:p>
         </w:tc>
         <w:tc>
           <w:tcPr>
+            <w:tcW w:type="dxa" w:w="1339"/>
             <w:tcBorders>
               <w:bottom w:val="single"/>
             </w:tcBorders>
             <w:vAlign w:val="bottom"/>
+            <w:shd w:val="clear" w:color="auto" w:fill="1F6FEB"/>
           </w:tcPr>
           <w:p>
             <w:pPr>
@@ -658,16 +700,23 @@
               <w:jc w:val="left"/>
             </w:pPr>
             <w:r>
+              <w:rPr>
+                <w:b/>
+                <w:color w:val="FFFFFF"/>
+                <w:sz w:val="19"/>
+              </w:rPr>
               <w:t xml:space="preserve">Duration</w:t>
             </w:r>
           </w:p>
         </w:tc>
         <w:tc>
           <w:tcPr>
+            <w:tcW w:type="dxa" w:w="2913"/>
             <w:tcBorders>
               <w:bottom w:val="single"/>
             </w:tcBorders>
             <w:vAlign w:val="bottom"/>
+            <w:shd w:val="clear" w:color="auto" w:fill="1F6FEB"/>
           </w:tcPr>
           <w:p>
             <w:pPr>
@@ -675,16 +724,23 @@
               <w:jc w:val="left"/>
             </w:pPr>
             <w:r>
+              <w:rPr>
+                <w:b/>
+                <w:color w:val="FFFFFF"/>
+                <w:sz w:val="19"/>
+              </w:rPr>
               <w:t xml:space="preserve">Topic / Activity</w:t>
             </w:r>
           </w:p>
         </w:tc>
         <w:tc>
           <w:tcPr>
+            <w:tcW w:type="dxa" w:w="1417"/>
             <w:tcBorders>
               <w:bottom w:val="single"/>
             </w:tcBorders>
             <w:vAlign w:val="bottom"/>
+            <w:shd w:val="clear" w:color="auto" w:fill="1F6FEB"/>
           </w:tcPr>
           <w:p>
             <w:pPr>
@@ -692,13 +748,44 @@
               <w:jc w:val="left"/>
             </w:pPr>
             <w:r>
+              <w:rPr>
+                <w:b/>
+                <w:color w:val="FFFFFF"/>
+                <w:sz w:val="19"/>
+              </w:rPr>
               <w:t xml:space="preserve">Method</w:t>
+            </w:r>
+          </w:p>
+        </w:tc>
+        <w:tc>
+          <w:tcPr>
+            <w:tcW w:type="dxa" w:w="1228"/>
+            <w:shd w:val="clear" w:color="auto" w:fill="1F6FEB"/>
+          </w:tcPr>
+          <w:p>
+            <w:r>
+              <w:rPr>
+                <w:b/>
+                <w:color w:val="FFFFFF"/>
+                <w:sz w:val="19"/>
+              </w:rPr>
+            </w:r>
+            <w:r>
+              <w:rPr>
+                <w:b/>
+                <w:color w:val="FFFFFF"/>
+                <w:sz w:val="19"/>
+              </w:rPr>
+              <w:t>Slides</w:t>
             </w:r>
           </w:p>
         </w:tc>
       </w:tr>
       <w:tr>
         <w:tc>
+          <w:tcPr>
+            <w:tcW w:type="dxa" w:w="1102"/>
+          </w:tcPr>
           <w:p>
             <w:pPr>
               <w:pStyle w:val="Compact"/>
@@ -710,6 +797,9 @@
           </w:p>
         </w:tc>
         <w:tc>
+          <w:tcPr>
+            <w:tcW w:type="dxa" w:w="1339"/>
+          </w:tcPr>
           <w:p>
             <w:pPr>
               <w:pStyle w:val="Compact"/>
@@ -721,6 +811,9 @@
           </w:p>
         </w:tc>
         <w:tc>
+          <w:tcPr>
+            <w:tcW w:type="dxa" w:w="2913"/>
+          </w:tcPr>
           <w:p>
             <w:pPr>
               <w:pStyle w:val="Compact"/>
@@ -741,6 +834,9 @@
           </w:p>
         </w:tc>
         <w:tc>
+          <w:tcPr>
+            <w:tcW w:type="dxa" w:w="1417"/>
+          </w:tcPr>
           <w:p>
             <w:pPr>
               <w:pStyle w:val="Compact"/>
@@ -751,9 +847,26 @@
             </w:r>
           </w:p>
         </w:tc>
+        <w:tc>
+          <w:tcPr>
+            <w:tcW w:type="dxa" w:w="1228"/>
+          </w:tcPr>
+          <w:p>
+            <w:r/>
+            <w:r>
+              <w:rPr>
+                <w:sz w:val="19"/>
+              </w:rPr>
+              <w:t>1–11</w:t>
+            </w:r>
+          </w:p>
+        </w:tc>
       </w:tr>
       <w:tr>
         <w:tc>
+          <w:tcPr>
+            <w:tcW w:type="dxa" w:w="1102"/>
+          </w:tcPr>
           <w:p>
             <w:pPr>
               <w:pStyle w:val="Compact"/>
@@ -765,6 +878,9 @@
           </w:p>
         </w:tc>
         <w:tc>
+          <w:tcPr>
+            <w:tcW w:type="dxa" w:w="1339"/>
+          </w:tcPr>
           <w:p>
             <w:pPr>
               <w:pStyle w:val="Compact"/>
@@ -776,6 +892,9 @@
           </w:p>
         </w:tc>
         <w:tc>
+          <w:tcPr>
+            <w:tcW w:type="dxa" w:w="2913"/>
+          </w:tcPr>
           <w:p>
             <w:pPr>
               <w:pStyle w:val="Compact"/>
@@ -796,6 +915,9 @@
           </w:p>
         </w:tc>
         <w:tc>
+          <w:tcPr>
+            <w:tcW w:type="dxa" w:w="1417"/>
+          </w:tcPr>
           <w:p>
             <w:pPr>
               <w:pStyle w:val="Compact"/>
@@ -806,9 +928,26 @@
             </w:r>
           </w:p>
         </w:tc>
+        <w:tc>
+          <w:tcPr>
+            <w:tcW w:type="dxa" w:w="1228"/>
+          </w:tcPr>
+          <w:p>
+            <w:r/>
+            <w:r>
+              <w:rPr>
+                <w:sz w:val="19"/>
+              </w:rPr>
+              <w:t>12–23</w:t>
+            </w:r>
+          </w:p>
+        </w:tc>
       </w:tr>
       <w:tr>
         <w:tc>
+          <w:tcPr>
+            <w:tcW w:type="dxa" w:w="1102"/>
+          </w:tcPr>
           <w:p>
             <w:pPr>
               <w:pStyle w:val="Compact"/>
@@ -820,6 +959,9 @@
           </w:p>
         </w:tc>
         <w:tc>
+          <w:tcPr>
+            <w:tcW w:type="dxa" w:w="1339"/>
+          </w:tcPr>
           <w:p>
             <w:pPr>
               <w:pStyle w:val="Compact"/>
@@ -831,6 +973,9 @@
           </w:p>
         </w:tc>
         <w:tc>
+          <w:tcPr>
+            <w:tcW w:type="dxa" w:w="2913"/>
+          </w:tcPr>
           <w:p>
             <w:pPr>
               <w:pStyle w:val="Compact"/>
@@ -845,6 +990,9 @@
           </w:p>
         </w:tc>
         <w:tc>
+          <w:tcPr>
+            <w:tcW w:type="dxa" w:w="1417"/>
+          </w:tcPr>
           <w:p>
             <w:pPr>
               <w:pStyle w:val="Compact"/>
@@ -855,9 +1003,26 @@
             </w:r>
           </w:p>
         </w:tc>
+        <w:tc>
+          <w:tcPr>
+            <w:tcW w:type="dxa" w:w="1228"/>
+          </w:tcPr>
+          <w:p>
+            <w:r/>
+            <w:r>
+              <w:rPr>
+                <w:sz w:val="19"/>
+              </w:rPr>
+              <w:t>—</w:t>
+            </w:r>
+          </w:p>
+        </w:tc>
       </w:tr>
       <w:tr>
         <w:tc>
+          <w:tcPr>
+            <w:tcW w:type="dxa" w:w="1102"/>
+          </w:tcPr>
           <w:p>
             <w:pPr>
               <w:pStyle w:val="Compact"/>
@@ -869,6 +1034,9 @@
           </w:p>
         </w:tc>
         <w:tc>
+          <w:tcPr>
+            <w:tcW w:type="dxa" w:w="1339"/>
+          </w:tcPr>
           <w:p>
             <w:pPr>
               <w:pStyle w:val="Compact"/>
@@ -880,6 +1048,9 @@
           </w:p>
         </w:tc>
         <w:tc>
+          <w:tcPr>
+            <w:tcW w:type="dxa" w:w="2913"/>
+          </w:tcPr>
           <w:p>
             <w:pPr>
               <w:pStyle w:val="Compact"/>
@@ -900,6 +1071,9 @@
           </w:p>
         </w:tc>
         <w:tc>
+          <w:tcPr>
+            <w:tcW w:type="dxa" w:w="1417"/>
+          </w:tcPr>
           <w:p>
             <w:pPr>
               <w:pStyle w:val="Compact"/>
@@ -910,9 +1084,26 @@
             </w:r>
           </w:p>
         </w:tc>
+        <w:tc>
+          <w:tcPr>
+            <w:tcW w:type="dxa" w:w="1228"/>
+          </w:tcPr>
+          <w:p>
+            <w:r/>
+            <w:r>
+              <w:rPr>
+                <w:sz w:val="19"/>
+              </w:rPr>
+              <w:t>30–38</w:t>
+            </w:r>
+          </w:p>
+        </w:tc>
       </w:tr>
       <w:tr>
         <w:tc>
+          <w:tcPr>
+            <w:tcW w:type="dxa" w:w="1102"/>
+          </w:tcPr>
           <w:p>
             <w:pPr>
               <w:pStyle w:val="Compact"/>
@@ -924,6 +1115,9 @@
           </w:p>
         </w:tc>
         <w:tc>
+          <w:tcPr>
+            <w:tcW w:type="dxa" w:w="1339"/>
+          </w:tcPr>
           <w:p>
             <w:pPr>
               <w:pStyle w:val="Compact"/>
@@ -935,6 +1129,9 @@
           </w:p>
         </w:tc>
         <w:tc>
+          <w:tcPr>
+            <w:tcW w:type="dxa" w:w="2913"/>
+          </w:tcPr>
           <w:p>
             <w:pPr>
               <w:pStyle w:val="Compact"/>
@@ -955,6 +1152,9 @@
           </w:p>
         </w:tc>
         <w:tc>
+          <w:tcPr>
+            <w:tcW w:type="dxa" w:w="1417"/>
+          </w:tcPr>
           <w:p>
             <w:pPr>
               <w:pStyle w:val="Compact"/>
@@ -965,9 +1165,26 @@
             </w:r>
           </w:p>
         </w:tc>
+        <w:tc>
+          <w:tcPr>
+            <w:tcW w:type="dxa" w:w="1228"/>
+          </w:tcPr>
+          <w:p>
+            <w:r/>
+            <w:r>
+              <w:rPr>
+                <w:sz w:val="19"/>
+              </w:rPr>
+              <w:t>24–29</w:t>
+            </w:r>
+          </w:p>
+        </w:tc>
       </w:tr>
       <w:tr>
         <w:tc>
+          <w:tcPr>
+            <w:tcW w:type="dxa" w:w="1102"/>
+          </w:tcPr>
           <w:p>
             <w:pPr>
               <w:pStyle w:val="Compact"/>
@@ -979,6 +1196,9 @@
           </w:p>
         </w:tc>
         <w:tc>
+          <w:tcPr>
+            <w:tcW w:type="dxa" w:w="1339"/>
+          </w:tcPr>
           <w:p>
             <w:pPr>
               <w:pStyle w:val="Compact"/>
@@ -990,6 +1210,9 @@
           </w:p>
         </w:tc>
         <w:tc>
+          <w:tcPr>
+            <w:tcW w:type="dxa" w:w="2913"/>
+          </w:tcPr>
           <w:p>
             <w:pPr>
               <w:pStyle w:val="Compact"/>
@@ -1004,6 +1227,9 @@
           </w:p>
         </w:tc>
         <w:tc>
+          <w:tcPr>
+            <w:tcW w:type="dxa" w:w="1417"/>
+          </w:tcPr>
           <w:p>
             <w:pPr>
               <w:pStyle w:val="Compact"/>
@@ -1014,9 +1240,26 @@
             </w:r>
           </w:p>
         </w:tc>
+        <w:tc>
+          <w:tcPr>
+            <w:tcW w:type="dxa" w:w="1228"/>
+          </w:tcPr>
+          <w:p>
+            <w:r/>
+            <w:r>
+              <w:rPr>
+                <w:sz w:val="19"/>
+              </w:rPr>
+              <w:t>—</w:t>
+            </w:r>
+          </w:p>
+        </w:tc>
       </w:tr>
       <w:tr>
         <w:tc>
+          <w:tcPr>
+            <w:tcW w:type="dxa" w:w="1102"/>
+          </w:tcPr>
           <w:p>
             <w:pPr>
               <w:pStyle w:val="Compact"/>
@@ -1028,6 +1271,9 @@
           </w:p>
         </w:tc>
         <w:tc>
+          <w:tcPr>
+            <w:tcW w:type="dxa" w:w="1339"/>
+          </w:tcPr>
           <w:p>
             <w:pPr>
               <w:pStyle w:val="Compact"/>
@@ -1039,6 +1285,9 @@
           </w:p>
         </w:tc>
         <w:tc>
+          <w:tcPr>
+            <w:tcW w:type="dxa" w:w="2913"/>
+          </w:tcPr>
           <w:p>
             <w:pPr>
               <w:pStyle w:val="Compact"/>
@@ -1068,6 +1317,9 @@
           </w:p>
         </w:tc>
         <w:tc>
+          <w:tcPr>
+            <w:tcW w:type="dxa" w:w="1417"/>
+          </w:tcPr>
           <w:p>
             <w:pPr>
               <w:pStyle w:val="Compact"/>
@@ -1078,9 +1330,26 @@
             </w:r>
           </w:p>
         </w:tc>
+        <w:tc>
+          <w:tcPr>
+            <w:tcW w:type="dxa" w:w="1228"/>
+          </w:tcPr>
+          <w:p>
+            <w:r/>
+            <w:r>
+              <w:rPr>
+                <w:sz w:val="19"/>
+              </w:rPr>
+              <w:t>39–42</w:t>
+            </w:r>
+          </w:p>
+        </w:tc>
       </w:tr>
       <w:tr>
         <w:tc>
+          <w:tcPr>
+            <w:tcW w:type="dxa" w:w="1102"/>
+          </w:tcPr>
           <w:p>
             <w:pPr>
               <w:pStyle w:val="Compact"/>
@@ -1092,6 +1361,9 @@
           </w:p>
         </w:tc>
         <w:tc>
+          <w:tcPr>
+            <w:tcW w:type="dxa" w:w="1339"/>
+          </w:tcPr>
           <w:p>
             <w:pPr>
               <w:pStyle w:val="Compact"/>
@@ -1103,6 +1375,9 @@
           </w:p>
         </w:tc>
         <w:tc>
+          <w:tcPr>
+            <w:tcW w:type="dxa" w:w="2913"/>
+          </w:tcPr>
           <w:p>
             <w:pPr>
               <w:pStyle w:val="Compact"/>
@@ -1132,6 +1407,9 @@
           </w:p>
         </w:tc>
         <w:tc>
+          <w:tcPr>
+            <w:tcW w:type="dxa" w:w="1417"/>
+          </w:tcPr>
           <w:p>
             <w:pPr>
               <w:pStyle w:val="Compact"/>
@@ -1142,9 +1420,26 @@
             </w:r>
           </w:p>
         </w:tc>
+        <w:tc>
+          <w:tcPr>
+            <w:tcW w:type="dxa" w:w="1228"/>
+          </w:tcPr>
+          <w:p>
+            <w:r/>
+            <w:r>
+              <w:rPr>
+                <w:sz w:val="19"/>
+              </w:rPr>
+              <w:t>43–47</w:t>
+            </w:r>
+          </w:p>
+        </w:tc>
       </w:tr>
       <w:tr>
         <w:tc>
+          <w:tcPr>
+            <w:tcW w:type="dxa" w:w="1102"/>
+          </w:tcPr>
           <w:p>
             <w:pPr>
               <w:pStyle w:val="Compact"/>
@@ -1156,6 +1451,9 @@
           </w:p>
         </w:tc>
         <w:tc>
+          <w:tcPr>
+            <w:tcW w:type="dxa" w:w="1339"/>
+          </w:tcPr>
           <w:p>
             <w:pPr>
               <w:pStyle w:val="Compact"/>
@@ -1167,6 +1465,9 @@
           </w:p>
         </w:tc>
         <w:tc>
+          <w:tcPr>
+            <w:tcW w:type="dxa" w:w="2913"/>
+          </w:tcPr>
           <w:p>
             <w:pPr>
               <w:pStyle w:val="Compact"/>
@@ -1181,6 +1482,9 @@
           </w:p>
         </w:tc>
         <w:tc>
+          <w:tcPr>
+            <w:tcW w:type="dxa" w:w="1417"/>
+          </w:tcPr>
           <w:p>
             <w:pPr>
               <w:pStyle w:val="Compact"/>
@@ -1191,9 +1495,26 @@
             </w:r>
           </w:p>
         </w:tc>
+        <w:tc>
+          <w:tcPr>
+            <w:tcW w:type="dxa" w:w="1228"/>
+          </w:tcPr>
+          <w:p>
+            <w:r/>
+            <w:r>
+              <w:rPr>
+                <w:sz w:val="19"/>
+              </w:rPr>
+              <w:t>—</w:t>
+            </w:r>
+          </w:p>
+        </w:tc>
       </w:tr>
       <w:tr>
         <w:tc>
+          <w:tcPr>
+            <w:tcW w:type="dxa" w:w="1102"/>
+          </w:tcPr>
           <w:p>
             <w:pPr>
               <w:pStyle w:val="Compact"/>
@@ -1205,6 +1526,9 @@
           </w:p>
         </w:tc>
         <w:tc>
+          <w:tcPr>
+            <w:tcW w:type="dxa" w:w="1339"/>
+          </w:tcPr>
           <w:p>
             <w:pPr>
               <w:pStyle w:val="Compact"/>
@@ -1216,6 +1540,9 @@
           </w:p>
         </w:tc>
         <w:tc>
+          <w:tcPr>
+            <w:tcW w:type="dxa" w:w="2913"/>
+          </w:tcPr>
           <w:p>
             <w:pPr>
               <w:pStyle w:val="Compact"/>
@@ -1245,6 +1572,9 @@
           </w:p>
         </w:tc>
         <w:tc>
+          <w:tcPr>
+            <w:tcW w:type="dxa" w:w="1417"/>
+          </w:tcPr>
           <w:p>
             <w:pPr>
               <w:pStyle w:val="Compact"/>
@@ -1255,9 +1585,26 @@
             </w:r>
           </w:p>
         </w:tc>
+        <w:tc>
+          <w:tcPr>
+            <w:tcW w:type="dxa" w:w="1228"/>
+          </w:tcPr>
+          <w:p>
+            <w:r/>
+            <w:r>
+              <w:rPr>
+                <w:sz w:val="19"/>
+              </w:rPr>
+              <w:t>48–50</w:t>
+            </w:r>
+          </w:p>
+        </w:tc>
       </w:tr>
       <w:tr>
         <w:tc>
+          <w:tcPr>
+            <w:tcW w:type="dxa" w:w="1102"/>
+          </w:tcPr>
           <w:p>
             <w:pPr>
               <w:pStyle w:val="Compact"/>
@@ -1269,6 +1616,9 @@
           </w:p>
         </w:tc>
         <w:tc>
+          <w:tcPr>
+            <w:tcW w:type="dxa" w:w="1339"/>
+          </w:tcPr>
           <w:p>
             <w:pPr>
               <w:pStyle w:val="Compact"/>
@@ -1280,6 +1630,9 @@
           </w:p>
         </w:tc>
         <w:tc>
+          <w:tcPr>
+            <w:tcW w:type="dxa" w:w="2913"/>
+          </w:tcPr>
           <w:p>
             <w:pPr>
               <w:pStyle w:val="Compact"/>
@@ -1309,6 +1662,9 @@
           </w:p>
         </w:tc>
         <w:tc>
+          <w:tcPr>
+            <w:tcW w:type="dxa" w:w="1417"/>
+          </w:tcPr>
           <w:p>
             <w:pPr>
               <w:pStyle w:val="Compact"/>
@@ -1319,9 +1675,26 @@
             </w:r>
           </w:p>
         </w:tc>
+        <w:tc>
+          <w:tcPr>
+            <w:tcW w:type="dxa" w:w="1228"/>
+          </w:tcPr>
+          <w:p>
+            <w:r/>
+            <w:r>
+              <w:rPr>
+                <w:sz w:val="19"/>
+              </w:rPr>
+              <w:t>51–56</w:t>
+            </w:r>
+          </w:p>
+        </w:tc>
       </w:tr>
       <w:tr>
         <w:tc>
+          <w:tcPr>
+            <w:tcW w:type="dxa" w:w="1102"/>
+          </w:tcPr>
           <w:p>
             <w:pPr>
               <w:pStyle w:val="Compact"/>
@@ -1333,6 +1706,9 @@
           </w:p>
         </w:tc>
         <w:tc>
+          <w:tcPr>
+            <w:tcW w:type="dxa" w:w="1339"/>
+          </w:tcPr>
           <w:p>
             <w:pPr>
               <w:pStyle w:val="Compact"/>
@@ -1344,6 +1720,9 @@
           </w:p>
         </w:tc>
         <w:tc>
+          <w:tcPr>
+            <w:tcW w:type="dxa" w:w="2913"/>
+          </w:tcPr>
           <w:p>
             <w:pPr>
               <w:pStyle w:val="Compact"/>
@@ -1364,6 +1743,9 @@
           </w:p>
         </w:tc>
         <w:tc>
+          <w:tcPr>
+            <w:tcW w:type="dxa" w:w="1417"/>
+          </w:tcPr>
           <w:p>
             <w:pPr>
               <w:pStyle w:val="Compact"/>
@@ -1374,9 +1756,26 @@
             </w:r>
           </w:p>
         </w:tc>
+        <w:tc>
+          <w:tcPr>
+            <w:tcW w:type="dxa" w:w="1228"/>
+          </w:tcPr>
+          <w:p>
+            <w:r/>
+            <w:r>
+              <w:rPr>
+                <w:sz w:val="19"/>
+              </w:rPr>
+              <w:t>57–60</w:t>
+            </w:r>
+          </w:p>
+        </w:tc>
       </w:tr>
       <w:tr>
         <w:tc>
+          <w:tcPr>
+            <w:tcW w:type="dxa" w:w="1102"/>
+          </w:tcPr>
           <w:p>
             <w:pPr>
               <w:pStyle w:val="Compact"/>
@@ -1388,6 +1787,9 @@
           </w:p>
         </w:tc>
         <w:tc>
+          <w:tcPr>
+            <w:tcW w:type="dxa" w:w="1339"/>
+          </w:tcPr>
           <w:p>
             <w:pPr>
               <w:pStyle w:val="Compact"/>
@@ -1399,6 +1801,9 @@
           </w:p>
         </w:tc>
         <w:tc>
+          <w:tcPr>
+            <w:tcW w:type="dxa" w:w="2913"/>
+          </w:tcPr>
           <w:p>
             <w:pPr>
               <w:pStyle w:val="Compact"/>
@@ -1419,6 +1824,9 @@
           </w:p>
         </w:tc>
         <w:tc>
+          <w:tcPr>
+            <w:tcW w:type="dxa" w:w="1417"/>
+          </w:tcPr>
           <w:p>
             <w:pPr>
               <w:pStyle w:val="Compact"/>
@@ -1429,9 +1837,26 @@
             </w:r>
           </w:p>
         </w:tc>
+        <w:tc>
+          <w:tcPr>
+            <w:tcW w:type="dxa" w:w="1228"/>
+          </w:tcPr>
+          <w:p>
+            <w:r/>
+            <w:r>
+              <w:rPr>
+                <w:sz w:val="19"/>
+              </w:rPr>
+              <w:t>61–64</w:t>
+            </w:r>
+          </w:p>
+        </w:tc>
       </w:tr>
       <w:tr>
         <w:tc>
+          <w:tcPr>
+            <w:tcW w:type="dxa" w:w="1102"/>
+          </w:tcPr>
           <w:p>
             <w:pPr>
               <w:pStyle w:val="Compact"/>
@@ -1443,6 +1868,9 @@
           </w:p>
         </w:tc>
         <w:tc>
+          <w:tcPr>
+            <w:tcW w:type="dxa" w:w="1339"/>
+          </w:tcPr>
           <w:p>
             <w:pPr>
               <w:pStyle w:val="Compact"/>
@@ -1454,6 +1882,9 @@
           </w:p>
         </w:tc>
         <w:tc>
+          <w:tcPr>
+            <w:tcW w:type="dxa" w:w="2913"/>
+          </w:tcPr>
           <w:p>
             <w:pPr>
               <w:pStyle w:val="Compact"/>
@@ -1474,6 +1905,9 @@
           </w:p>
         </w:tc>
         <w:tc>
+          <w:tcPr>
+            <w:tcW w:type="dxa" w:w="1417"/>
+          </w:tcPr>
           <w:p>
             <w:pPr>
               <w:pStyle w:val="Compact"/>
@@ -1484,9 +1918,26 @@
             </w:r>
           </w:p>
         </w:tc>
+        <w:tc>
+          <w:tcPr>
+            <w:tcW w:type="dxa" w:w="1228"/>
+          </w:tcPr>
+          <w:p>
+            <w:r/>
+            <w:r>
+              <w:rPr>
+                <w:sz w:val="19"/>
+              </w:rPr>
+              <w:t>—</w:t>
+            </w:r>
+          </w:p>
+        </w:tc>
       </w:tr>
       <w:tr>
         <w:tc>
+          <w:tcPr>
+            <w:tcW w:type="dxa" w:w="1102"/>
+          </w:tcPr>
           <w:p>
             <w:pPr>
               <w:pStyle w:val="Compact"/>
@@ -1498,6 +1949,9 @@
           </w:p>
         </w:tc>
         <w:tc>
+          <w:tcPr>
+            <w:tcW w:type="dxa" w:w="1339"/>
+          </w:tcPr>
           <w:p>
             <w:pPr>
               <w:pStyle w:val="Compact"/>
@@ -1509,6 +1963,9 @@
           </w:p>
         </w:tc>
         <w:tc>
+          <w:tcPr>
+            <w:tcW w:type="dxa" w:w="2913"/>
+          </w:tcPr>
           <w:p>
             <w:pPr>
               <w:pStyle w:val="Compact"/>
@@ -1529,6 +1986,9 @@
           </w:p>
         </w:tc>
         <w:tc>
+          <w:tcPr>
+            <w:tcW w:type="dxa" w:w="1417"/>
+          </w:tcPr>
           <w:p>
             <w:pPr>
               <w:pStyle w:val="Compact"/>
@@ -1536,6 +1996,20 @@
             </w:pPr>
             <w:r>
               <w:t xml:space="preserve">Assessment</w:t>
+            </w:r>
+          </w:p>
+        </w:tc>
+        <w:tc>
+          <w:tcPr>
+            <w:tcW w:type="dxa" w:w="1228"/>
+          </w:tcPr>
+          <w:p>
+            <w:r/>
+            <w:r>
+              <w:rPr>
+                <w:sz w:val="19"/>
+              </w:rPr>
+              <w:t>—</w:t>
             </w:r>
           </w:p>
         </w:tc>
@@ -1578,6 +2052,10 @@
         <w:t xml:space="preserve">Topic 1 — Claude Code Fundamentals (≈ 1 hr 15 min + Activity 1)</w:t>
       </w:r>
       <w:bookmarkEnd w:id="3"/>
+      <w:r>
+        <w:rPr/>
+        <w:t xml:space="preserve">  ·  Slides 12–38</w:t>
+      </w:r>
     </w:p>
     <w:p>
       <w:pPr>
@@ -1681,6 +2159,10 @@
         <w:t xml:space="preserve">Topic 2 — Tools and Commands (≈ 1 hr 30 min incl. activities)</w:t>
       </w:r>
       <w:bookmarkEnd w:id="4"/>
+      <w:r>
+        <w:rPr/>
+        <w:t xml:space="preserve">  ·  Slides 39–47</w:t>
+      </w:r>
     </w:p>
     <w:p>
       <w:pPr>
@@ -1778,6 +2260,10 @@
         <w:t xml:space="preserve">Topic 3 — Skills, Agents &amp; Hooks (≈ 1 hr 30 min + Mini Capstone)</w:t>
       </w:r>
       <w:bookmarkEnd w:id="5"/>
+      <w:r>
+        <w:rPr/>
+        <w:t xml:space="preserve">  ·  Slides 48–60</w:t>
+      </w:r>
     </w:p>
     <w:p>
       <w:pPr>
@@ -2077,6 +2563,7 @@
       </w:r>
     </w:p>
     <w:sectPr>
+      <w:footerReference w:type="default" r:id="rId10"/>
       <w:pgSz w:w="12240" w:h="15840"/>
       <w:pgMar w:top="1080" w:right="1440" w:bottom="1080" w:left="1440" w:header="720" w:footer="720" w:gutter="0"/>
       <w:cols w:space="720"/>
@@ -2084,6 +2571,64 @@
     </w:sectPr>
   </w:body>
 </w:document>
+</file>
+
+<file path=word/footer1.xml><?xml version="1.0" encoding="utf-8"?>
+<w:ftr xmlns:m="http://schemas.openxmlformats.org/officeDocument/2006/math" xmlns:mc="http://schemas.openxmlformats.org/markup-compatibility/2006" xmlns:mo="http://schemas.microsoft.com/office/mac/office/2008/main" xmlns:mv="urn:schemas-microsoft-com:mac:vml" xmlns:o="urn:schemas-microsoft-com:office:office" xmlns:r="http://schemas.openxmlformats.org/officeDocument/2006/relationships" xmlns:v="urn:schemas-microsoft-com:vml" xmlns:w10="urn:schemas-microsoft-com:office:word" xmlns:w14="http://schemas.microsoft.com/office/word/2010/wordml" xmlns:w="http://schemas.openxmlformats.org/wordprocessingml/2006/main" xmlns:wne="http://schemas.microsoft.com/office/word/2006/wordml" xmlns:wp14="http://schemas.microsoft.com/office/word/2010/wordprocessingDrawing" xmlns:wp="http://schemas.openxmlformats.org/drawingml/2006/wordprocessingDrawing" xmlns:wpc="http://schemas.microsoft.com/office/word/2010/wordprocessingCanvas" xmlns:wpg="http://schemas.microsoft.com/office/word/2010/wordprocessingGroup" xmlns:wpi="http://schemas.microsoft.com/office/word/2010/wordprocessingInk" xmlns:wps="http://schemas.microsoft.com/office/word/2010/wordprocessingShape" mc:Ignorable="w14 wp14">
+  <w:p>
+    <w:pPr>
+      <w:pStyle w:val="Footer"/>
+      <w:jc w:val="center"/>
+    </w:pPr>
+    <w:r/>
+    <w:r>
+      <w:rPr>
+        <w:color w:val="555B66"/>
+        <w:sz w:val="18"/>
+      </w:rPr>
+      <w:t xml:space="preserve">Page </w:t>
+    </w:r>
+    <w:r>
+      <w:rPr>
+        <w:sz w:val="18"/>
+      </w:rPr>
+      <w:fldChar w:fldCharType="begin"/>
+      <w:instrText xml:space="preserve">PAGE</w:instrText>
+      <w:fldChar w:fldCharType="separate"/>
+      <w:t>1</w:t>
+      <w:fldChar w:fldCharType="end"/>
+    </w:r>
+    <w:r>
+      <w:rPr>
+        <w:color w:val="555B66"/>
+        <w:sz w:val="18"/>
+      </w:rPr>
+      <w:t xml:space="preserve"> of </w:t>
+    </w:r>
+    <w:r>
+      <w:rPr>
+        <w:sz w:val="18"/>
+      </w:rPr>
+      <w:fldChar w:fldCharType="begin"/>
+      <w:instrText xml:space="preserve">NUMPAGES</w:instrText>
+      <w:fldChar w:fldCharType="separate"/>
+      <w:t>1</w:t>
+      <w:fldChar w:fldCharType="end"/>
+    </w:r>
+  </w:p>
+  <w:p>
+    <w:pPr>
+      <w:jc w:val="center"/>
+    </w:pPr>
+    <w:r>
+      <w:rPr>
+        <w:color w:val="555B66"/>
+        <w:sz w:val="15"/>
+      </w:rPr>
+      <w:t>© 2026 Tertiary Infotech Academy Pte Ltd. All rights reserved.  ·  www.tertiarycourses.com.sg</w:t>
+    </w:r>
+  </w:p>
+</w:ftr>
 </file>
 
 <file path=word/numbering.xml><?xml version="1.0" encoding="utf-8"?>

</xml_diff>

<commit_message>
fix(LP): recompute all slide references against deck v15 (v1.9)
Inserting the Lab Materials slide at position 8 shifted every later
slide by one, which the previous correction did not account for — it
was computed against v14 numbering.

All schedule rows and topic headings are now recomputed against the
actual v15 deck:
  Welcome & Administration  1–12      Topic 2.1       41–45
  Topic 1.1                 13–30     Topic 2.2       46–50
  Topic 1.2                 32–39     Topic 3.1       51–54
  Activity 1                31, 40    Topic 3.2       55–60
                                      Mini Capstone   61–64
                                      Closing         65–70

Topic headings: Topic 1 = 13–40, Topic 2 = 41–50, Topic 3 = 51–64.

Co-Authored-By: Claude Opus 5 (1M context) <noreply@anthropic.com>
</commit_message>
<xml_diff>
--- a/courseware/LP-Agentic AI Applications with Claude Code.docx
+++ b/courseware/LP-Agentic AI Applications with Claude Code.docx
@@ -169,7 +169,7 @@
           <w:b/>
           <w:sz w:val="24"/>
         </w:rPr>
-        <w:t>Version 1.8</w:t>
+        <w:t>Version 1.9</w:t>
       </w:r>
     </w:p>
     <w:p>
@@ -830,6 +830,48 @@
           </w:p>
         </w:tc>
       </w:tr>
+      <w:tr>
+        <w:tc>
+          <w:tcPr>
+            <w:tcW w:type="dxa" w:w="2340"/>
+          </w:tcPr>
+          <w:p>
+            <w:r>
+              <w:t xml:space="preserve">1.9</w:t>
+            </w:r>
+          </w:p>
+        </w:tc>
+        <w:tc>
+          <w:tcPr>
+            <w:tcW w:type="dxa" w:w="2340"/>
+          </w:tcPr>
+          <w:p>
+            <w:r>
+              <w:t xml:space="preserve">9 Sep 2026</w:t>
+            </w:r>
+          </w:p>
+        </w:tc>
+        <w:tc>
+          <w:tcPr>
+            <w:tcW w:type="dxa" w:w="2340"/>
+          </w:tcPr>
+          <w:p>
+            <w:r>
+              <w:t xml:space="preserve">Recomputed every slide reference against deck v15 after the Lab Materials slide insert shifted numbering by one: Topic 1.2 = 32–39, Activity 1 = 31 and 40, and all other schedule rows and topic headings realigned.</w:t>
+            </w:r>
+          </w:p>
+        </w:tc>
+        <w:tc>
+          <w:tcPr>
+            <w:tcW w:type="dxa" w:w="2340"/>
+          </w:tcPr>
+          <w:p>
+            <w:r>
+              <w:t xml:space="preserve">Tertiary Infotech Academy Pte Ltd</w:t>
+            </w:r>
+          </w:p>
+        </w:tc>
+      </w:tr>
     </w:tbl>
     <w:p>
       <w:r>
@@ -1200,12 +1242,8 @@
             <w:tcW w:type="dxa" w:w="1228"/>
           </w:tcPr>
           <w:p>
-            <w:r/>
             <w:r>
-              <w:rPr>
-                <w:sz w:val="19"/>
-              </w:rPr>
-              <w:t>1–11</w:t>
+              <w:t xml:space="preserve">1–12</w:t>
             </w:r>
           </w:p>
         </w:tc>
@@ -1282,12 +1320,7 @@
           </w:tcPr>
           <w:p>
             <w:r>
-              <w:t>12–24</w:t>
-            </w:r>
-            <w:r>
-              <w:rPr>
-                <w:sz w:val="19"/>
-              </w:rPr>
+              <w:t xml:space="preserve">13–30</w:t>
             </w:r>
           </w:p>
         </w:tc>
@@ -1439,7 +1472,7 @@
           </w:tcPr>
           <w:p>
             <w:r>
-              <w:t xml:space="preserve">31–38</w:t>
+              <w:t xml:space="preserve">32–39</w:t>
             </w:r>
           </w:p>
         </w:tc>
@@ -1516,7 +1549,7 @@
           </w:tcPr>
           <w:p>
             <w:r>
-              <w:t xml:space="preserve">25–30, 39</w:t>
+              <w:t xml:space="preserve">31, 40</w:t>
             </w:r>
           </w:p>
         </w:tc>
@@ -1677,12 +1710,7 @@
           </w:tcPr>
           <w:p>
             <w:r>
-              <w:t>40–44</w:t>
-            </w:r>
-            <w:r>
-              <w:rPr>
-                <w:sz w:val="19"/>
-              </w:rPr>
+              <w:t xml:space="preserve">41–45</w:t>
             </w:r>
           </w:p>
         </w:tc>
@@ -1768,12 +1796,7 @@
           </w:tcPr>
           <w:p>
             <w:r>
-              <w:t>45–49</w:t>
-            </w:r>
-            <w:r>
-              <w:rPr>
-                <w:sz w:val="19"/>
-              </w:rPr>
+              <w:t xml:space="preserve">46–50</w:t>
             </w:r>
           </w:p>
         </w:tc>
@@ -1934,12 +1957,7 @@
           </w:tcPr>
           <w:p>
             <w:r>
-              <w:t>50–53</w:t>
-            </w:r>
-            <w:r>
-              <w:rPr>
-                <w:sz w:val="19"/>
-              </w:rPr>
+              <w:t xml:space="preserve">51–54</w:t>
             </w:r>
           </w:p>
         </w:tc>
@@ -2025,12 +2043,7 @@
           </w:tcPr>
           <w:p>
             <w:r>
-              <w:t>54–59</w:t>
-            </w:r>
-            <w:r>
-              <w:rPr>
-                <w:sz w:val="19"/>
-              </w:rPr>
+              <w:t xml:space="preserve">55–60</w:t>
             </w:r>
           </w:p>
         </w:tc>
@@ -2107,12 +2120,7 @@
           </w:tcPr>
           <w:p>
             <w:r>
-              <w:t>60–63</w:t>
-            </w:r>
-            <w:r>
-              <w:rPr>
-                <w:sz w:val="19"/>
-              </w:rPr>
+              <w:t xml:space="preserve">61–64</w:t>
             </w:r>
           </w:p>
         </w:tc>
@@ -2183,7 +2191,7 @@
           </w:tcPr>
           <w:p>
             <w:r>
-              <w:t xml:space="preserve">64–69</w:t>
+              <w:t xml:space="preserve">65–70</w:t>
             </w:r>
           </w:p>
         </w:tc>
@@ -2385,7 +2393,7 @@
       </w:pPr>
       <w:bookmarkStart w:id="3" w:name="Xb9290cd5cfd3cee39c1461a7fce98dad9f6772d"/>
       <w:r>
-        <w:t>Topic 1 — Claude Code Fundamentals (≈ 1 hr 15 min + Activity 1)  ·  Slides 12–39</w:t>
+        <w:t>Topic 1 — Claude Code Fundamentals (≈ 1 hr 15 min + Activity 1)  ·  Slides 13–40</w:t>
       </w:r>
       <w:bookmarkEnd w:id="3"/>
       <w:r>
@@ -2491,7 +2499,7 @@
       </w:pPr>
       <w:bookmarkStart w:id="4" w:name="X73ca5d129f6cc1e36951d8e1fdfed440c79a748"/>
       <w:r>
-        <w:t>Topic 2 — Tools and Commands (≈ 1 hr 30 min incl. activities)  ·  Slides 40–49</w:t>
+        <w:t>Topic 2 — Tools and Commands (≈ 1 hr 30 min incl. activities)  ·  Slides 41–50</w:t>
       </w:r>
       <w:bookmarkEnd w:id="4"/>
       <w:r>
@@ -2591,7 +2599,7 @@
       </w:pPr>
       <w:bookmarkStart w:id="5" w:name="Xdea2e2f9d65e6adc3f0e170b560c3465e8774bb"/>
       <w:r>
-        <w:t>Topic 3 — Skills, Agents &amp; Hooks (≈ 1 hr 30 min + Mini Capstone)  ·  Slides 50–63</w:t>
+        <w:t>Topic 3 — Skills, Agents &amp; Hooks (≈ 1 hr 30 min + Mini Capstone)  ·  Slides 51–64</w:t>
       </w:r>
       <w:bookmarkEnd w:id="5"/>
       <w:r>

</xml_diff>